<commit_message>
perf: smooth page thumbnail drag and drop
Improve page reordering performance by avoiding unnecessary thumbnail grid rebuilds during drag and drop. Update the technical documentation, specifications, PDF export, and rebuilt executable for v1.1.0.
</commit_message>
<xml_diff>
--- a/Specifications techniques MultiPrep.docx
+++ b/Specifications techniques MultiPrep.docx
@@ -649,8 +649,8 @@
         <w:tblLook w:val="04A0" w:firstRow="1" w:lastRow="0" w:firstColumn="1" w:lastColumn="0" w:noHBand="0" w:noVBand="1"/>
       </w:tblPr>
       <w:tblGrid>
-        <w:gridCol w:w="3672"/>
-        <w:gridCol w:w="6911"/>
+        <w:gridCol w:w="3368"/>
+        <w:gridCol w:w="9628"/>
       </w:tblGrid>
       <w:tr>
         <w:tc>
@@ -904,7 +904,7 @@
                 <w:sz w:val="20"/>
                 <w:szCs w:val="20"/>
               </w:rPr>
-              <w:t xml:space="preserve"> avec drag and drop personnalisé.</w:t>
+              <w:t xml:space="preserve"> avec drag and drop personnalisé optimisé pour limiter les reconstructions de miniatures.</w:t>
             </w:r>
           </w:p>
         </w:tc>
@@ -1049,9 +1049,9 @@
         <w:tblLook w:val="04A0" w:firstRow="1" w:lastRow="0" w:firstColumn="1" w:lastColumn="0" w:noHBand="0" w:noVBand="1"/>
       </w:tblPr>
       <w:tblGrid>
-        <w:gridCol w:w="2323"/>
-        <w:gridCol w:w="6731"/>
-        <w:gridCol w:w="3942"/>
+        <w:gridCol w:w="2322"/>
+        <w:gridCol w:w="6737"/>
+        <w:gridCol w:w="3937"/>
       </w:tblGrid>
       <w:tr>
         <w:tc>
@@ -1359,7 +1359,7 @@
                 <w:sz w:val="20"/>
                 <w:szCs w:val="20"/>
               </w:rPr>
-              <w:t xml:space="preserve"> visuel.</w:t>
+              <w:t xml:space="preserve"> visuel déplacé pendant le mouvement, puis reconstruction finale au dépôt.</w:t>
             </w:r>
           </w:p>
         </w:tc>
@@ -2019,8 +2019,8 @@
       <w:tblGrid>
         <w:gridCol w:w="1573"/>
         <w:gridCol w:w="1047"/>
-        <w:gridCol w:w="5583"/>
-        <w:gridCol w:w="4793"/>
+        <w:gridCol w:w="4753"/>
+        <w:gridCol w:w="5623"/>
       </w:tblGrid>
       <w:tr>
         <w:tc>
@@ -2273,7 +2273,7 @@
                 <w:sz w:val="20"/>
                 <w:szCs w:val="20"/>
               </w:rPr>
-              <w:t>Très adapté au rendu rapide de pages PDF pour l’aperçu visuel.</w:t>
+              <w:t>Très adapté au rendu rapide de pages PDF pour l’aperçu visuel déplacé pendant le mouvement, puis reconstruction finale au dépôt.</w:t>
             </w:r>
           </w:p>
         </w:tc>
@@ -2298,6 +2298,7 @@
                 <w:sz w:val="21"/>
                 <w:szCs w:val="21"/>
               </w:rPr>
+              <w:lastRenderedPageBreak/>
               <w:t>pypdf</w:t>
             </w:r>
             <w:proofErr w:type="spellEnd"/>
@@ -3025,7 +3026,6 @@
       </w:pPr>
       <w:bookmarkStart w:id="3" w:name="sec_4_architecture"/>
       <w:r>
-        <w:lastRenderedPageBreak/>
         <w:t>4. Architecture du projet</w:t>
       </w:r>
       <w:bookmarkEnd w:id="3"/>
@@ -4695,8 +4695,8 @@
         <w:tblLook w:val="04A0" w:firstRow="1" w:lastRow="0" w:firstColumn="1" w:lastColumn="0" w:noHBand="0" w:noVBand="1"/>
       </w:tblPr>
       <w:tblGrid>
-        <w:gridCol w:w="2232"/>
-        <w:gridCol w:w="10764"/>
+        <w:gridCol w:w="2167"/>
+        <w:gridCol w:w="10829"/>
       </w:tblGrid>
       <w:tr>
         <w:tc>
@@ -5161,7 +5161,7 @@
                 <w:sz w:val="20"/>
                 <w:szCs w:val="20"/>
               </w:rPr>
-              <w:t xml:space="preserve"> après drag and drop.</w:t>
+              <w:t xml:space="preserve"> après drag and drop sans demander à la grille de se reconstruire une seconde fois.</w:t>
             </w:r>
           </w:p>
         </w:tc>
@@ -5588,6 +5588,7 @@
                 <w:sz w:val="21"/>
                 <w:szCs w:val="21"/>
               </w:rPr>
+              <w:lastRenderedPageBreak/>
               <w:t>temp</w:t>
             </w:r>
             <w:proofErr w:type="gramEnd"/>
@@ -5678,7 +5679,6 @@
                 <w:sz w:val="21"/>
                 <w:szCs w:val="21"/>
               </w:rPr>
-              <w:lastRenderedPageBreak/>
               <w:t>temp</w:t>
             </w:r>
             <w:proofErr w:type="gramEnd"/>
@@ -6528,6 +6528,7 @@
                 <w:sz w:val="21"/>
                 <w:szCs w:val="21"/>
               </w:rPr>
+              <w:lastRenderedPageBreak/>
               <w:t>dist</w:t>
             </w:r>
             <w:proofErr w:type="spellEnd"/>
@@ -6594,7 +6595,6 @@
       </w:pPr>
       <w:proofErr w:type="spellStart"/>
       <w:r>
-        <w:lastRenderedPageBreak/>
         <w:t>PyInstaller</w:t>
       </w:r>
       <w:proofErr w:type="spellEnd"/>
@@ -6996,6 +6996,11 @@
     </w:p>
     <w:p>
       <w:pPr>
+        <w:spacing w:before="120" w:after="120"/>
+      </w:pPr>
+    </w:p>
+    <w:p>
+      <w:pPr>
         <w:pStyle w:val="Titre2"/>
         <w:spacing w:before="360" w:after="180"/>
       </w:pPr>
@@ -7086,6 +7091,7 @@
                 <w:sz w:val="21"/>
                 <w:szCs w:val="21"/>
               </w:rPr>
+              <w:lastRenderedPageBreak/>
               <w:t>Corrective</w:t>
             </w:r>
           </w:p>
@@ -7224,7 +7230,6 @@
                 <w:sz w:val="21"/>
                 <w:szCs w:val="21"/>
               </w:rPr>
-              <w:lastRenderedPageBreak/>
               <w:t>Documentaire</w:t>
             </w:r>
           </w:p>
@@ -7919,7 +7924,6 @@
         <w:spacing w:before="120" w:after="120"/>
       </w:pPr>
     </w:p>
-    <w:p/>
     <w:sectPr>
       <w:footerReference w:type="default" r:id="rId8"/>
       <w:pgSz w:w="15840" w:h="12240" w:orient="landscape"/>
@@ -10382,6 +10386,7 @@
   <w:style w:type="character" w:default="1" w:styleId="Policepardfaut">
     <w:name w:val="Default Paragraph Font"/>
     <w:uiPriority w:val="1"/>
+    <w:semiHidden/>
     <w:unhideWhenUsed/>
   </w:style>
   <w:style w:type="table" w:default="1" w:styleId="TableauNormal">

</xml_diff>

<commit_message>
docs: document pinned dependencies for v1.1.1
</commit_message>
<xml_diff>
--- a/Specifications techniques MultiPrep.docx
+++ b/Specifications techniques MultiPrep.docx
@@ -32,7 +32,7 @@
         <w:pStyle w:val="Standard"/>
       </w:pPr>
       <w:r>
-        <w:t>Version documentée : v1.1.0</w:t>
+        <w:t>Version documentée : v1.1.1</w:t>
       </w:r>
     </w:p>
     <w:p>
@@ -40,13 +40,13 @@
         <w:pStyle w:val="Standard"/>
       </w:pPr>
       <w:r>
-        <w:t xml:space="preserve">Date : </w:t>
+        <w:t xml:space="preserve">Date : 1 juin 2026</w:t>
       </w:r>
       <w:r>
-        <w:t xml:space="preserve">11 </w:t>
+        <w:t xml:space="preserve"/>
       </w:r>
       <w:r>
-        <w:t>mai 2026</w:t>
+        <w:t/>
       </w:r>
     </w:p>
     <w:p>
@@ -2137,15 +2137,15 @@
                 <w:sz w:val="20"/>
                 <w:szCs w:val="20"/>
               </w:rPr>
-              <w:t>&gt;= 6</w:t>
-            </w:r>
-            <w:r>
-              <w:rPr>
-                <w:color w:val="111827"/>
-                <w:sz w:val="20"/>
-                <w:szCs w:val="20"/>
-              </w:rPr>
-              <w:t>.11</w:t>
+              <w:t>&gt;= 6.6</w:t>
+            </w:r>
+            <w:r>
+              <w:rPr>
+                <w:color w:val="111827"/>
+                <w:sz w:val="20"/>
+                <w:szCs w:val="20"/>
+              </w:rPr>
+              <w:t/>
             </w:r>
           </w:p>
         </w:tc>
@@ -2227,15 +2227,15 @@
                 <w:sz w:val="20"/>
                 <w:szCs w:val="20"/>
               </w:rPr>
-              <w:t>&gt;= 1.2</w:t>
-            </w:r>
-            <w:r>
-              <w:rPr>
-                <w:color w:val="111827"/>
-                <w:sz w:val="20"/>
-                <w:szCs w:val="20"/>
-              </w:rPr>
-              <w:t>7</w:t>
+              <w:t>== 1.26.7</w:t>
+            </w:r>
+            <w:r>
+              <w:rPr>
+                <w:color w:val="111827"/>
+                <w:sz w:val="20"/>
+                <w:szCs w:val="20"/>
+              </w:rPr>
+              <w:t/>
             </w:r>
           </w:p>
         </w:tc>
@@ -2320,7 +2320,7 @@
                 <w:sz w:val="20"/>
                 <w:szCs w:val="20"/>
               </w:rPr>
-              <w:t>&gt;= 4.0</w:t>
+              <w:t>== 6.10.2</w:t>
             </w:r>
           </w:p>
         </w:tc>
@@ -6899,7 +6899,7 @@
                 <w:sz w:val="20"/>
                 <w:szCs w:val="20"/>
               </w:rPr>
-              <w:t>Le projet limite les bibliothèques externes à trois dépendances principales.</w:t>
+              <w:t>Le projet limite les bibliothèques externes à trois dépendances principales. Les versions de PyMuPDF et pypdf sont épinglées dans requirements.txt pour garantir des installations reproductibles.</w:t>
             </w:r>
           </w:p>
         </w:tc>

</xml_diff>